<commit_message>
feat(cartas): soportar firma y matricula institucional
- Calcula la matricula desde RUT numerico y ano de ingreso.

- Permite subir firma administrada para las plantillas de carta.

- Ajusta la plantilla DOCX y las pruebas de generacion.
</commit_message>
<xml_diff>
--- a/app/core/assets/presentation_letter_template.docx
+++ b/app/core/assets/presentation_letter_template.docx
@@ -1,11 +1,10 @@
 
 <file path=word/document.xml><?xml version="1.0" encoding="utf-8"?>
-<w:document xmlns:mc="http://schemas.openxmlformats.org/markup-compatibility/2006" xmlns:ve="http://schemas.openxmlformats.org/markup-compatibility/2006" xmlns:o="urn:schemas-microsoft-com:office:office" xmlns:r="http://schemas.openxmlformats.org/officeDocument/2006/relationships" xmlns:m="http://schemas.openxmlformats.org/officeDocument/2006/math" xmlns:v="urn:schemas-microsoft-com:vml" xmlns:wp="http://schemas.openxmlformats.org/drawingml/2006/wordprocessingDrawing" xmlns:w10="urn:schemas-microsoft-com:office:word" xmlns:w="http://schemas.openxmlformats.org/wordprocessingml/2006/main" xmlns:wne="http://schemas.microsoft.com/office/word/2006/wordml" xmlns:a="http://schemas.openxmlformats.org/drawingml/2006/main" xmlns:pic="http://schemas.openxmlformats.org/drawingml/2006/picture" xmlns:wpg="http://schemas.microsoft.com/office/word/2010/wordprocessingGroup" xmlns:wps="http://schemas.microsoft.com/office/word/2010/wordprocessingShape" xmlns:w14="http://schemas.microsoft.com/office/word/2010/wordml" mc:Ignorable="w14" xml:space="preserve">
+<w:document xmlns:wpc="http://schemas.microsoft.com/office/word/2010/wordprocessingCanvas" xmlns:cx="http://schemas.microsoft.com/office/drawing/2014/chartex" xmlns:cx1="http://schemas.microsoft.com/office/drawing/2015/9/8/chartex" xmlns:cx2="http://schemas.microsoft.com/office/drawing/2015/10/21/chartex" xmlns:cx3="http://schemas.microsoft.com/office/drawing/2016/5/9/chartex" xmlns:cx4="http://schemas.microsoft.com/office/drawing/2016/5/10/chartex" xmlns:cx5="http://schemas.microsoft.com/office/drawing/2016/5/11/chartex" xmlns:cx6="http://schemas.microsoft.com/office/drawing/2016/5/12/chartex" xmlns:cx7="http://schemas.microsoft.com/office/drawing/2016/5/13/chartex" xmlns:cx8="http://schemas.microsoft.com/office/drawing/2016/5/14/chartex" xmlns:mc="http://schemas.openxmlformats.org/markup-compatibility/2006" xmlns:aink="http://schemas.microsoft.com/office/drawing/2016/ink" xmlns:am3d="http://schemas.microsoft.com/office/drawing/2017/model3d" xmlns:o="urn:schemas-microsoft-com:office:office" xmlns:oel="http://schemas.microsoft.com/office/2019/extlst" xmlns:r="http://schemas.openxmlformats.org/officeDocument/2006/relationships" xmlns:m="http://schemas.openxmlformats.org/officeDocument/2006/math" xmlns:v="urn:schemas-microsoft-com:vml" xmlns:wp14="http://schemas.microsoft.com/office/word/2010/wordprocessingDrawing" xmlns:wp="http://schemas.openxmlformats.org/drawingml/2006/wordprocessingDrawing" xmlns:w10="urn:schemas-microsoft-com:office:word" xmlns:w="http://schemas.openxmlformats.org/wordprocessingml/2006/main" xmlns:w14="http://schemas.microsoft.com/office/word/2010/wordml" xmlns:w15="http://schemas.microsoft.com/office/word/2012/wordml" xmlns:w16cex="http://schemas.microsoft.com/office/word/2018/wordml/cex" xmlns:w16cid="http://schemas.microsoft.com/office/word/2016/wordml/cid" xmlns:w16="http://schemas.microsoft.com/office/word/2018/wordml" xmlns:w16du="http://schemas.microsoft.com/office/word/2023/wordml/word16du" xmlns:w16sdtdh="http://schemas.microsoft.com/office/word/2020/wordml/sdtdatahash" xmlns:w16sdtfl="http://schemas.microsoft.com/office/word/2024/wordml/sdtformatlock" xmlns:w16se="http://schemas.microsoft.com/office/word/2015/wordml/symex" xmlns:wpg="http://schemas.microsoft.com/office/word/2010/wordprocessingGroup" xmlns:wpi="http://schemas.microsoft.com/office/word/2010/wordprocessingInk" xmlns:wne="http://schemas.microsoft.com/office/word/2006/wordml" xmlns:wps="http://schemas.microsoft.com/office/word/2010/wordprocessingShape" mc:Ignorable="w14 w15 w16se w16cid w16 w16cex w16sdtdh w16sdtfl w16du wp14">
   <w:body>
     <w:p>
       <w:pPr>
-        <w:spacing w:line="240" w:lineRule="auto"/>
-        <w:ind w:left="361" w:right="0" w:firstLine="0"/>
+        <w:ind w:left="361"/>
         <w:rPr>
           <w:rFonts w:ascii="Times New Roman"/>
           <w:sz w:val="20"/>
@@ -14,19 +13,20 @@
       <w:r>
         <w:rPr>
           <w:rFonts w:ascii="Times New Roman"/>
+          <w:noProof/>
           <w:sz w:val="20"/>
         </w:rPr>
         <w:drawing>
-          <wp:inline distT="0" distB="0" distL="0" distR="0">
+          <wp:inline distT="0" distB="0" distL="0" distR="0" wp14:anchorId="5846DCDE" wp14:editId="31941966">
             <wp:extent cx="2044805" cy="730376"/>
             <wp:effectExtent l="0" t="0" r="0" b="0"/>
             <wp:docPr id="1" name="Image 1"/>
             <wp:cNvGraphicFramePr>
-              <a:graphicFrameLocks/>
+              <a:graphicFrameLocks xmlns:a="http://schemas.openxmlformats.org/drawingml/2006/main"/>
             </wp:cNvGraphicFramePr>
-            <a:graphic>
+            <a:graphic xmlns:a="http://schemas.openxmlformats.org/drawingml/2006/main">
               <a:graphicData uri="http://schemas.openxmlformats.org/drawingml/2006/picture">
-                <pic:pic>
+                <pic:pic xmlns:pic="http://schemas.openxmlformats.org/drawingml/2006/picture">
                   <pic:nvPicPr>
                     <pic:cNvPr id="1" name="Image 1"/>
                     <pic:cNvPicPr/>
@@ -52,71 +52,105 @@
           </wp:inline>
         </w:drawing>
       </w:r>
-      <w:r>
-        <w:rPr>
-          <w:rFonts w:ascii="Times New Roman"/>
-          <w:sz w:val="20"/>
-        </w:rPr>
-      </w:r>
-    </w:p>
-    <w:p>
-      <w:pPr>
-        <w:pStyle w:val="BodyText"/>
+    </w:p>
+    <w:p>
+      <w:pPr>
+        <w:pStyle w:val="Textoindependiente"/>
         <w:spacing w:before="160"/>
         <w:ind w:right="170"/>
         <w:jc w:val="right"/>
       </w:pPr>
-      <w:r>
-        <w:rPr/>
-        <w:t>{{ date }}</w:t>
-      </w:r>
-    </w:p>
-    <w:p>
-      <w:pPr>
-        <w:pStyle w:val="BodyText"/>
+      <w:proofErr w:type="gramStart"/>
+      <w:r>
+        <w:t>{{ date</w:t>
+      </w:r>
+      <w:proofErr w:type="gramEnd"/>
+      <w:r>
+        <w:t xml:space="preserve"> }}</w:t>
+      </w:r>
+    </w:p>
+    <w:p>
+      <w:pPr>
+        <w:pStyle w:val="Textoindependiente"/>
         <w:spacing w:before="19"/>
       </w:pPr>
     </w:p>
     <w:p>
       <w:pPr>
-        <w:spacing w:before="0"/>
-        <w:ind w:left="158" w:right="0" w:firstLine="0"/>
+        <w:ind w:left="158"/>
         <w:jc w:val="center"/>
         <w:rPr>
           <w:b/>
           <w:sz w:val="20"/>
         </w:rPr>
       </w:pPr>
+      <w:proofErr w:type="gramStart"/>
       <w:r>
         <w:rPr>
           <w:b/>
           <w:spacing w:val="-2"/>
           <w:sz w:val="20"/>
         </w:rPr>
-        <w:t>{{ title }}</w:t>
-      </w:r>
-    </w:p>
-    <w:p>
-      <w:pPr>
-        <w:spacing w:before="0"/>
-        <w:ind w:left="158" w:right="0" w:firstLine="0"/>
+        <w:t xml:space="preserve">{{ </w:t>
+      </w:r>
+      <w:proofErr w:type="spellStart"/>
+      <w:r>
+        <w:rPr>
+          <w:b/>
+          <w:spacing w:val="-2"/>
+          <w:sz w:val="20"/>
+        </w:rPr>
+        <w:t>title</w:t>
+      </w:r>
+      <w:proofErr w:type="spellEnd"/>
+      <w:proofErr w:type="gramEnd"/>
+      <w:r>
+        <w:rPr>
+          <w:b/>
+          <w:spacing w:val="-2"/>
+          <w:sz w:val="20"/>
+        </w:rPr>
+        <w:t xml:space="preserve"> }}</w:t>
+      </w:r>
+    </w:p>
+    <w:p>
+      <w:pPr>
+        <w:ind w:left="158"/>
         <w:jc w:val="center"/>
         <w:rPr>
           <w:b/>
           <w:sz w:val="20"/>
         </w:rPr>
       </w:pPr>
+      <w:proofErr w:type="gramStart"/>
       <w:r>
         <w:rPr>
           <w:b/>
           <w:sz w:val="20"/>
         </w:rPr>
-        <w:t>{{ subtitle }}</w:t>
-      </w:r>
-    </w:p>
-    <w:p>
-      <w:pPr>
-        <w:pStyle w:val="BodyText"/>
+        <w:t xml:space="preserve">{{ </w:t>
+      </w:r>
+      <w:proofErr w:type="spellStart"/>
+      <w:r>
+        <w:rPr>
+          <w:b/>
+          <w:sz w:val="20"/>
+        </w:rPr>
+        <w:t>subtitle</w:t>
+      </w:r>
+      <w:proofErr w:type="spellEnd"/>
+      <w:proofErr w:type="gramEnd"/>
+      <w:r>
+        <w:rPr>
+          <w:b/>
+          <w:sz w:val="20"/>
+        </w:rPr>
+        <w:t xml:space="preserve"> }}</w:t>
+      </w:r>
+    </w:p>
+    <w:p>
+      <w:pPr>
+        <w:pStyle w:val="Textoindependiente"/>
         <w:spacing w:before="15"/>
         <w:rPr>
           <w:b/>
@@ -125,259 +159,447 @@
     </w:p>
     <w:p>
       <w:pPr>
-        <w:spacing w:before="0"/>
-        <w:ind w:left="331" w:right="0" w:firstLine="0"/>
+        <w:spacing w:before="240" w:after="240" w:line="360" w:lineRule="auto"/>
+        <w:ind w:left="331"/>
         <w:jc w:val="both"/>
         <w:rPr>
           <w:b/>
           <w:sz w:val="20"/>
         </w:rPr>
       </w:pPr>
+      <w:proofErr w:type="gramStart"/>
       <w:r>
         <w:rPr>
           <w:b/>
           <w:sz w:val="20"/>
         </w:rPr>
-        <w:t>{{ greeting }}</w:t>
-      </w:r>
-    </w:p>
-    <w:p>
-      <w:pPr>
-        <w:pStyle w:val="BodyText"/>
-        <w:spacing w:before="15"/>
+        <w:t xml:space="preserve">{{ </w:t>
+      </w:r>
+      <w:proofErr w:type="spellStart"/>
+      <w:r>
         <w:rPr>
           <w:b/>
-        </w:rPr>
-      </w:pPr>
-    </w:p>
-    <w:p>
-      <w:pPr>
-        <w:pStyle w:val="BodyText"/>
-        <w:spacing w:line="259" w:lineRule="auto"/>
+          <w:sz w:val="20"/>
+        </w:rPr>
+        <w:t>greeting</w:t>
+      </w:r>
+      <w:proofErr w:type="spellEnd"/>
+      <w:proofErr w:type="gramEnd"/>
+      <w:r>
+        <w:rPr>
+          <w:b/>
+          <w:sz w:val="20"/>
+        </w:rPr>
+        <w:t xml:space="preserve"> }}</w:t>
+      </w:r>
+    </w:p>
+    <w:p>
+      <w:pPr>
+        <w:pStyle w:val="Textoindependiente"/>
+        <w:spacing w:before="240" w:after="240" w:line="360" w:lineRule="auto"/>
         <w:ind w:left="331" w:right="178"/>
         <w:jc w:val="both"/>
       </w:pPr>
-      <w:r>
-        <w:rPr/>
-        <w:t>{{ base_intro }}</w:t>
-      </w:r>
-    </w:p>
-    <w:p>
-      <w:pPr>
-        <w:pStyle w:val="BodyText"/>
-        <w:spacing w:line="259" w:lineRule="auto" w:before="240"/>
+      <w:proofErr w:type="gramStart"/>
+      <w:r>
+        <w:t xml:space="preserve">{{ </w:t>
+      </w:r>
+      <w:proofErr w:type="spellStart"/>
+      <w:r>
+        <w:t>base</w:t>
+      </w:r>
+      <w:proofErr w:type="gramEnd"/>
+      <w:r>
+        <w:t>_</w:t>
+      </w:r>
+      <w:proofErr w:type="gramStart"/>
+      <w:r>
+        <w:t>intro</w:t>
+      </w:r>
+      <w:proofErr w:type="spellEnd"/>
+      <w:r>
+        <w:t xml:space="preserve"> }</w:t>
+      </w:r>
+      <w:proofErr w:type="gramEnd"/>
+      <w:r>
+        <w:t>}</w:t>
+      </w:r>
+    </w:p>
+    <w:p>
+      <w:pPr>
+        <w:pStyle w:val="Textoindependiente"/>
+        <w:spacing w:before="240" w:after="240" w:line="360" w:lineRule="auto"/>
         <w:ind w:left="331" w:right="176"/>
         <w:jc w:val="both"/>
       </w:pPr>
-      <w:r>
-        <w:rPr/>
-        <w:t>{{ student_presentation }}</w:t>
-      </w:r>
-    </w:p>
-    <w:p>
-      <w:pPr>
-        <w:pStyle w:val="BodyText"/>
-        <w:spacing w:line="259" w:lineRule="auto" w:before="239"/>
+      <w:proofErr w:type="gramStart"/>
+      <w:r>
+        <w:t xml:space="preserve">{{ </w:t>
+      </w:r>
+      <w:proofErr w:type="spellStart"/>
+      <w:r>
+        <w:t>student</w:t>
+      </w:r>
+      <w:proofErr w:type="gramEnd"/>
+      <w:r>
+        <w:t>_</w:t>
+      </w:r>
+      <w:proofErr w:type="gramStart"/>
+      <w:r>
+        <w:t>presentation</w:t>
+      </w:r>
+      <w:proofErr w:type="spellEnd"/>
+      <w:r>
+        <w:t xml:space="preserve"> }</w:t>
+      </w:r>
+      <w:proofErr w:type="gramEnd"/>
+      <w:r>
+        <w:t>}</w:t>
+      </w:r>
+    </w:p>
+    <w:p>
+      <w:pPr>
+        <w:pStyle w:val="Textoindependiente"/>
+        <w:spacing w:before="240" w:after="240" w:line="360" w:lineRule="auto"/>
         <w:ind w:left="331" w:right="174"/>
         <w:jc w:val="both"/>
       </w:pPr>
-      <w:r>
-        <w:rPr/>
-        <w:t>{{ practice_description }}</w:t>
-      </w:r>
-    </w:p>
-    <w:p>
-      <w:pPr>
-        <w:spacing w:line="259" w:lineRule="auto" w:before="239"/>
-        <w:ind w:left="331" w:right="174" w:firstLine="0"/>
+      <w:proofErr w:type="gramStart"/>
+      <w:r>
+        <w:t xml:space="preserve">{{ </w:t>
+      </w:r>
+      <w:proofErr w:type="spellStart"/>
+      <w:r>
+        <w:t>practice</w:t>
+      </w:r>
+      <w:proofErr w:type="gramEnd"/>
+      <w:r>
+        <w:t>_</w:t>
+      </w:r>
+      <w:proofErr w:type="gramStart"/>
+      <w:r>
+        <w:t>description</w:t>
+      </w:r>
+      <w:proofErr w:type="spellEnd"/>
+      <w:r>
+        <w:t xml:space="preserve"> }</w:t>
+      </w:r>
+      <w:proofErr w:type="gramEnd"/>
+      <w:r>
+        <w:t>}</w:t>
+      </w:r>
+    </w:p>
+    <w:p>
+      <w:pPr>
+        <w:spacing w:before="240" w:after="240" w:line="360" w:lineRule="auto"/>
+        <w:ind w:left="331" w:right="174"/>
         <w:jc w:val="both"/>
         <w:rPr>
           <w:sz w:val="20"/>
         </w:rPr>
       </w:pPr>
-      <w:r>
-        <w:rPr>
-          <w:sz w:val="20"/>
-        </w:rPr>
-        <w:t>{{ minimum_hours_clause }}</w:t>
-      </w:r>
-    </w:p>
-    <w:p>
-      <w:pPr>
-        <w:pStyle w:val="BodyText"/>
-      </w:pPr>
-    </w:p>
-    <w:p>
-      <w:pPr>
-        <w:pStyle w:val="BodyText"/>
-        <w:spacing w:before="14"/>
-      </w:pPr>
+      <w:proofErr w:type="gramStart"/>
+      <w:r>
+        <w:rPr>
+          <w:sz w:val="20"/>
+        </w:rPr>
+        <w:t xml:space="preserve">{{ </w:t>
+      </w:r>
+      <w:proofErr w:type="spellStart"/>
+      <w:r>
+        <w:rPr>
+          <w:sz w:val="20"/>
+        </w:rPr>
+        <w:t>minimum</w:t>
+      </w:r>
+      <w:proofErr w:type="gramEnd"/>
+      <w:r>
+        <w:rPr>
+          <w:sz w:val="20"/>
+        </w:rPr>
+        <w:t>_hours_</w:t>
+      </w:r>
+      <w:proofErr w:type="gramStart"/>
+      <w:r>
+        <w:rPr>
+          <w:sz w:val="20"/>
+        </w:rPr>
+        <w:t>clause</w:t>
+      </w:r>
+      <w:proofErr w:type="spellEnd"/>
+      <w:r>
+        <w:rPr>
+          <w:sz w:val="20"/>
+        </w:rPr>
+        <w:t xml:space="preserve"> }</w:t>
+      </w:r>
+      <w:proofErr w:type="gramEnd"/>
+      <w:r>
+        <w:rPr>
+          <w:sz w:val="20"/>
+        </w:rPr>
+        <w:t>}</w:t>
+      </w:r>
     </w:p>
     <w:p>
       <w:pPr>
         <w:tabs>
-          <w:tab w:pos="489" w:val="left" w:leader="none"/>
+          <w:tab w:val="left" w:pos="489"/>
         </w:tabs>
-        <w:spacing w:line="259" w:lineRule="auto" w:before="1" w:after="0"/>
-        <w:ind w:right="179"/>
-        <w:jc w:val="left"/>
+        <w:spacing w:before="240" w:after="240" w:line="360" w:lineRule="auto"/>
+        <w:ind w:left="489" w:right="174"/>
         <w:rPr>
           <w:b/>
           <w:sz w:val="20"/>
         </w:rPr>
       </w:pPr>
-      <w:r>
-        <w:rPr>
-          <w:b/>
-          <w:sz w:val="20"/>
-        </w:rPr>
-        <w:t>{{ learning_outcomes_text }}</w:t>
-      </w:r>
-    </w:p>
-    <w:p>
-      <w:pPr>
-        <w:pStyle w:val="BodyText"/>
-        <w:rPr>
-          <w:b/>
-        </w:rPr>
-      </w:pPr>
-    </w:p>
-    <w:p>
-      <w:pPr>
-        <w:pStyle w:val="BodyText"/>
-        <w:spacing w:before="12"/>
-        <w:rPr>
-          <w:b/>
-        </w:rPr>
-      </w:pPr>
-    </w:p>
-    <w:p>
-      <w:pPr>
-        <w:pStyle w:val="BodyText"/>
-        <w:spacing w:line="259" w:lineRule="auto" w:before="1"/>
+      <w:proofErr w:type="gramStart"/>
+      <w:r>
+        <w:rPr>
+          <w:sz w:val="20"/>
+        </w:rPr>
+        <w:t xml:space="preserve">{{ </w:t>
+      </w:r>
+      <w:proofErr w:type="spellStart"/>
+      <w:r>
+        <w:rPr>
+          <w:sz w:val="20"/>
+        </w:rPr>
+        <w:t>learning</w:t>
+      </w:r>
+      <w:proofErr w:type="gramEnd"/>
+      <w:r>
+        <w:rPr>
+          <w:sz w:val="20"/>
+        </w:rPr>
+        <w:t>_outcomes_</w:t>
+      </w:r>
+      <w:proofErr w:type="gramStart"/>
+      <w:r>
+        <w:rPr>
+          <w:sz w:val="20"/>
+        </w:rPr>
+        <w:t>text</w:t>
+      </w:r>
+      <w:proofErr w:type="spellEnd"/>
+      <w:r>
+        <w:rPr>
+          <w:sz w:val="20"/>
+        </w:rPr>
+        <w:t xml:space="preserve"> }</w:t>
+      </w:r>
+      <w:proofErr w:type="gramEnd"/>
+      <w:r>
+        <w:rPr>
+          <w:sz w:val="20"/>
+        </w:rPr>
+        <w:t>}</w:t>
+      </w:r>
+    </w:p>
+    <w:p>
+      <w:pPr>
+        <w:pStyle w:val="Textoindependiente"/>
+        <w:spacing w:before="240" w:after="240" w:line="360" w:lineRule="auto"/>
         <w:ind w:left="331" w:right="183"/>
         <w:jc w:val="both"/>
       </w:pPr>
-      <w:r>
-        <w:rPr/>
-        <w:t>{{ insurance_clause }}</w:t>
-      </w:r>
-    </w:p>
-    <w:p>
-      <w:pPr>
-        <w:pStyle w:val="BodyText"/>
-        <w:spacing w:line="494" w:lineRule="auto" w:before="239"/>
+      <w:proofErr w:type="gramStart"/>
+      <w:r>
+        <w:t xml:space="preserve">{{ </w:t>
+      </w:r>
+      <w:proofErr w:type="spellStart"/>
+      <w:r>
+        <w:t>insurance</w:t>
+      </w:r>
+      <w:proofErr w:type="gramEnd"/>
+      <w:r>
+        <w:t>_</w:t>
+      </w:r>
+      <w:proofErr w:type="gramStart"/>
+      <w:r>
+        <w:t>clause</w:t>
+      </w:r>
+      <w:proofErr w:type="spellEnd"/>
+      <w:r>
+        <w:t xml:space="preserve"> }</w:t>
+      </w:r>
+      <w:proofErr w:type="gramEnd"/>
+      <w:r>
+        <w:t>}</w:t>
+      </w:r>
+    </w:p>
+    <w:p>
+      <w:pPr>
+        <w:pStyle w:val="Textoindependiente"/>
+        <w:spacing w:before="240" w:after="240" w:line="360" w:lineRule="auto"/>
         <w:ind w:left="331" w:right="1783"/>
-        <w:jc w:val="left"/>
-      </w:pPr>
-      <w:r>
-        <w:rPr/>
-        <w:t>{{ closing_text }}</w:t>
-      </w:r>
-    </w:p>
-    <w:p>
-      <w:pPr>
-        <w:pStyle w:val="BodyText"/>
-        <w:jc w:val="left"/>
-      </w:pPr>
-      <w:r>
-        <w:rPr/>
+      </w:pPr>
+      <w:proofErr w:type="gramStart"/>
+      <w:r>
+        <w:t xml:space="preserve">{{ </w:t>
+      </w:r>
+      <w:proofErr w:type="spellStart"/>
+      <w:r>
+        <w:t>closing</w:t>
+      </w:r>
+      <w:proofErr w:type="gramEnd"/>
+      <w:r>
+        <w:t>_</w:t>
+      </w:r>
+      <w:proofErr w:type="gramStart"/>
+      <w:r>
+        <w:t>text</w:t>
+      </w:r>
+      <w:proofErr w:type="spellEnd"/>
+      <w:r>
+        <w:t xml:space="preserve"> }</w:t>
+      </w:r>
+      <w:proofErr w:type="gramEnd"/>
+      <w:r>
+        <w:t>}</w:t>
+      </w:r>
+    </w:p>
+    <w:p>
+      <w:pPr>
+        <w:pStyle w:val="Textoindependiente"/>
+        <w:spacing w:before="240" w:after="240" w:line="360" w:lineRule="auto"/>
+      </w:pPr>
+      <w:r>
         <w:t>Atentamente,</w:t>
       </w:r>
     </w:p>
     <w:p>
       <w:pPr>
-        <w:pStyle w:val="BodyText"/>
+        <w:pStyle w:val="Textoindependiente"/>
         <w:spacing w:before="134"/>
       </w:pPr>
-      <w:r>
-        <w:rPr/>
-        <w:drawing>
-          <wp:anchor distT="0" distB="0" distL="0" distR="0" allowOverlap="1" layoutInCell="1" locked="0" behindDoc="1" simplePos="0" relativeHeight="487587840">
-            <wp:simplePos x="0" y="0"/>
-            <wp:positionH relativeFrom="page">
-              <wp:posOffset>2772536</wp:posOffset>
-            </wp:positionH>
-            <wp:positionV relativeFrom="paragraph">
-              <wp:posOffset>255687</wp:posOffset>
-            </wp:positionV>
-            <wp:extent cx="2435976" cy="1633537"/>
-            <wp:effectExtent l="0" t="0" r="0" b="0"/>
-            <wp:wrapTopAndBottom/>
-            <wp:docPr id="2" name="Image 2"/>
-            <wp:cNvGraphicFramePr>
-              <a:graphicFrameLocks/>
-            </wp:cNvGraphicFramePr>
-            <a:graphic>
-              <a:graphicData uri="http://schemas.openxmlformats.org/drawingml/2006/picture">
-                <pic:pic>
-                  <pic:nvPicPr>
-                    <pic:cNvPr id="2" name="Image 2"/>
-                    <pic:cNvPicPr/>
-                  </pic:nvPicPr>
-                  <pic:blipFill>
-                    <a:blip r:embed="rId6" cstate="print"/>
-                    <a:stretch>
-                      <a:fillRect/>
-                    </a:stretch>
-                  </pic:blipFill>
-                  <pic:spPr>
-                    <a:xfrm>
-                      <a:off x="0" y="0"/>
-                      <a:ext cx="2435976" cy="1633537"/>
-                    </a:xfrm>
-                    <a:prstGeom prst="rect">
-                      <a:avLst/>
-                    </a:prstGeom>
-                  </pic:spPr>
-                </pic:pic>
-              </a:graphicData>
-            </a:graphic>
-          </wp:anchor>
-        </w:drawing>
-      </w:r>
-    </w:p>
-    <w:p>
-      <w:pPr>
-        <w:pStyle w:val="Heading1"/>
-      </w:pPr>
-      <w:r>
-        <w:rPr/>
-        <w:t>{{ signature_name }}</w:t>
-      </w:r>
-    </w:p>
-    <w:p>
-      <w:pPr>
-        <w:pStyle w:val="BodyText"/>
-        <w:spacing w:line="259" w:lineRule="auto" w:before="19"/>
+    </w:p>
+    <w:p>
+      <w:pPr>
+        <w:jc w:val="center"/>
+      </w:pPr>
+      <w:proofErr w:type="gramStart"/>
+      <w:r>
+        <w:t xml:space="preserve">{{ </w:t>
+      </w:r>
+      <w:proofErr w:type="spellStart"/>
+      <w:r>
+        <w:t>signature</w:t>
+      </w:r>
+      <w:proofErr w:type="gramEnd"/>
+      <w:r>
+        <w:t>_</w:t>
+      </w:r>
+      <w:proofErr w:type="gramStart"/>
+      <w:r>
+        <w:t>image</w:t>
+      </w:r>
+      <w:proofErr w:type="spellEnd"/>
+      <w:r>
+        <w:t xml:space="preserve"> }</w:t>
+      </w:r>
+      <w:proofErr w:type="gramEnd"/>
+      <w:r>
+        <w:t>}</w:t>
+      </w:r>
+    </w:p>
+    <w:p>
+      <w:pPr>
+        <w:pStyle w:val="Ttulo1"/>
+      </w:pPr>
+      <w:proofErr w:type="gramStart"/>
+      <w:r>
+        <w:t xml:space="preserve">{{ </w:t>
+      </w:r>
+      <w:proofErr w:type="spellStart"/>
+      <w:r>
+        <w:t>signature</w:t>
+      </w:r>
+      <w:proofErr w:type="gramEnd"/>
+      <w:r>
+        <w:t>_</w:t>
+      </w:r>
+      <w:proofErr w:type="gramStart"/>
+      <w:r>
+        <w:t>name</w:t>
+      </w:r>
+      <w:proofErr w:type="spellEnd"/>
+      <w:r>
+        <w:t xml:space="preserve"> }</w:t>
+      </w:r>
+      <w:proofErr w:type="gramEnd"/>
+      <w:r>
+        <w:t>}</w:t>
+      </w:r>
+    </w:p>
+    <w:p>
+      <w:pPr>
+        <w:pStyle w:val="Textoindependiente"/>
+        <w:spacing w:before="19" w:line="259" w:lineRule="auto"/>
         <w:ind w:left="3703" w:right="3542"/>
         <w:jc w:val="center"/>
       </w:pPr>
-      <w:r>
-        <w:rPr/>
-        <w:t>{{ signature_role }}</w:t>
+      <w:proofErr w:type="gramStart"/>
+      <w:r>
+        <w:t xml:space="preserve">{{ </w:t>
+      </w:r>
+      <w:proofErr w:type="spellStart"/>
+      <w:r>
+        <w:t>signature</w:t>
+      </w:r>
+      <w:proofErr w:type="gramEnd"/>
+      <w:r>
+        <w:t>_role</w:t>
+      </w:r>
+      <w:proofErr w:type="spellEnd"/>
+      <w:r>
+        <w:t xml:space="preserve"> }}</w:t>
+      </w:r>
+      <w:r>
         <w:br/>
       </w:r>
-      <w:r>
-        <w:rPr/>
-        <w:t>{{ signature_institution }}</w:t>
+      <w:proofErr w:type="gramStart"/>
+      <w:r>
+        <w:t xml:space="preserve">{{ </w:t>
+      </w:r>
+      <w:proofErr w:type="spellStart"/>
+      <w:r>
+        <w:t>signature</w:t>
+      </w:r>
+      <w:proofErr w:type="gramEnd"/>
+      <w:r>
+        <w:t>_</w:t>
+      </w:r>
+      <w:proofErr w:type="gramStart"/>
+      <w:r>
+        <w:t>institution</w:t>
+      </w:r>
+      <w:proofErr w:type="spellEnd"/>
+      <w:r>
+        <w:t xml:space="preserve"> }</w:t>
+      </w:r>
+      <w:proofErr w:type="gramEnd"/>
+      <w:r>
+        <w:t>}</w:t>
       </w:r>
     </w:p>
     <w:sectPr>
       <w:type w:val="continuous"/>
       <w:pgSz w:w="12240" w:h="20160"/>
-      <w:pgMar w:top="680" w:bottom="280" w:left="1080" w:right="1440"/>
+      <w:pgMar w:top="680" w:right="1440" w:bottom="280" w:left="1080" w:header="720" w:footer="720" w:gutter="0"/>
+      <w:cols w:space="720"/>
     </w:sectPr>
   </w:body>
 </w:document>
 </file>
 
 <file path=word/numbering.xml><?xml version="1.0" encoding="utf-8"?>
-<w:numbering xmlns:ve="http://schemas.openxmlformats.org/markup-compatibility/2006" xmlns:o="urn:schemas-microsoft-com:office:office" xmlns:r="http://schemas.openxmlformats.org/officeDocument/2006/relationships" xmlns:m="http://schemas.openxmlformats.org/officeDocument/2006/math" xmlns:v="urn:schemas-microsoft-com:vml" xmlns:wp="http://schemas.openxmlformats.org/drawingml/2006/wordprocessingDrawing" xmlns:w10="urn:schemas-microsoft-com:office:word" xmlns:w="http://schemas.openxmlformats.org/wordprocessingml/2006/main" xmlns:wne="http://schemas.microsoft.com/office/word/2006/wordml">
-  <w:abstractNum w:abstractNumId="0">
+<w:numbering xmlns:wpc="http://schemas.microsoft.com/office/word/2010/wordprocessingCanvas" xmlns:cx="http://schemas.microsoft.com/office/drawing/2014/chartex" xmlns:cx1="http://schemas.microsoft.com/office/drawing/2015/9/8/chartex" xmlns:cx2="http://schemas.microsoft.com/office/drawing/2015/10/21/chartex" xmlns:cx3="http://schemas.microsoft.com/office/drawing/2016/5/9/chartex" xmlns:cx4="http://schemas.microsoft.com/office/drawing/2016/5/10/chartex" xmlns:cx5="http://schemas.microsoft.com/office/drawing/2016/5/11/chartex" xmlns:cx6="http://schemas.microsoft.com/office/drawing/2016/5/12/chartex" xmlns:cx7="http://schemas.microsoft.com/office/drawing/2016/5/13/chartex" xmlns:cx8="http://schemas.microsoft.com/office/drawing/2016/5/14/chartex" xmlns:mc="http://schemas.openxmlformats.org/markup-compatibility/2006" xmlns:aink="http://schemas.microsoft.com/office/drawing/2016/ink" xmlns:am3d="http://schemas.microsoft.com/office/drawing/2017/model3d" xmlns:o="urn:schemas-microsoft-com:office:office" xmlns:oel="http://schemas.microsoft.com/office/2019/extlst" xmlns:r="http://schemas.openxmlformats.org/officeDocument/2006/relationships" xmlns:m="http://schemas.openxmlformats.org/officeDocument/2006/math" xmlns:v="urn:schemas-microsoft-com:vml" xmlns:wp14="http://schemas.microsoft.com/office/word/2010/wordprocessingDrawing" xmlns:wp="http://schemas.openxmlformats.org/drawingml/2006/wordprocessingDrawing" xmlns:w10="urn:schemas-microsoft-com:office:word" xmlns:w="http://schemas.openxmlformats.org/wordprocessingml/2006/main" xmlns:w14="http://schemas.microsoft.com/office/word/2010/wordml" xmlns:w15="http://schemas.microsoft.com/office/word/2012/wordml" xmlns:w16cex="http://schemas.microsoft.com/office/word/2018/wordml/cex" xmlns:w16cid="http://schemas.microsoft.com/office/word/2016/wordml/cid" xmlns:w16="http://schemas.microsoft.com/office/word/2018/wordml" xmlns:w16du="http://schemas.microsoft.com/office/word/2023/wordml/word16du" xmlns:w16sdtdh="http://schemas.microsoft.com/office/word/2020/wordml/sdtdatahash" xmlns:w16sdtfl="http://schemas.microsoft.com/office/word/2024/wordml/sdtformatlock" xmlns:w16se="http://schemas.microsoft.com/office/word/2015/wordml/symex" xmlns:wpg="http://schemas.microsoft.com/office/word/2010/wordprocessingGroup" xmlns:wpi="http://schemas.microsoft.com/office/word/2010/wordprocessingInk" xmlns:wne="http://schemas.microsoft.com/office/word/2006/wordml" xmlns:wps="http://schemas.microsoft.com/office/word/2010/wordprocessingShape" mc:Ignorable="w14 w15 w16se w16cid w16 w16cex w16sdtdh w16sdtfl w16du wp14">
+  <w:abstractNum w:abstractNumId="0" w15:restartNumberingAfterBreak="0">
+    <w:nsid w:val="105B353A"/>
     <w:multiLevelType w:val="hybridMultilevel"/>
-    <w:lvl w:ilvl="0">
-      <w:start w:val="0"/>
+    <w:tmpl w:val="606228E2"/>
+    <w:lvl w:ilvl="0" w:tplc="E0EA281C">
       <w:numFmt w:val="bullet"/>
       <w:lvlText w:val="•"/>
       <w:lvlJc w:val="left"/>
@@ -385,7 +607,7 @@
         <w:ind w:left="331" w:hanging="160"/>
       </w:pPr>
       <w:rPr>
-        <w:rFonts w:hint="default" w:ascii="Calibri" w:hAnsi="Calibri" w:eastAsia="Calibri" w:cs="Calibri"/>
+        <w:rFonts w:ascii="Calibri" w:eastAsia="Calibri" w:hAnsi="Calibri" w:cs="Calibri" w:hint="default"/>
         <w:b/>
         <w:bCs/>
         <w:i w:val="0"/>
@@ -397,8 +619,7 @@
         <w:lang w:val="es-ES" w:eastAsia="en-US" w:bidi="ar-SA"/>
       </w:rPr>
     </w:lvl>
-    <w:lvl w:ilvl="1">
-      <w:start w:val="0"/>
+    <w:lvl w:ilvl="1" w:tplc="301CF844">
       <w:numFmt w:val="bullet"/>
       <w:lvlText w:val="•"/>
       <w:lvlJc w:val="left"/>
@@ -410,8 +631,7 @@
         <w:lang w:val="es-ES" w:eastAsia="en-US" w:bidi="ar-SA"/>
       </w:rPr>
     </w:lvl>
-    <w:lvl w:ilvl="2">
-      <w:start w:val="0"/>
+    <w:lvl w:ilvl="2" w:tplc="07C67CD2">
       <w:numFmt w:val="bullet"/>
       <w:lvlText w:val="•"/>
       <w:lvlJc w:val="left"/>
@@ -423,8 +643,7 @@
         <w:lang w:val="es-ES" w:eastAsia="en-US" w:bidi="ar-SA"/>
       </w:rPr>
     </w:lvl>
-    <w:lvl w:ilvl="3">
-      <w:start w:val="0"/>
+    <w:lvl w:ilvl="3" w:tplc="FC36319A">
       <w:numFmt w:val="bullet"/>
       <w:lvlText w:val="•"/>
       <w:lvlJc w:val="left"/>
@@ -436,8 +655,7 @@
         <w:lang w:val="es-ES" w:eastAsia="en-US" w:bidi="ar-SA"/>
       </w:rPr>
     </w:lvl>
-    <w:lvl w:ilvl="4">
-      <w:start w:val="0"/>
+    <w:lvl w:ilvl="4" w:tplc="63C87F2C">
       <w:numFmt w:val="bullet"/>
       <w:lvlText w:val="•"/>
       <w:lvlJc w:val="left"/>
@@ -449,8 +667,7 @@
         <w:lang w:val="es-ES" w:eastAsia="en-US" w:bidi="ar-SA"/>
       </w:rPr>
     </w:lvl>
-    <w:lvl w:ilvl="5">
-      <w:start w:val="0"/>
+    <w:lvl w:ilvl="5" w:tplc="5A9816BA">
       <w:numFmt w:val="bullet"/>
       <w:lvlText w:val="•"/>
       <w:lvlJc w:val="left"/>
@@ -462,8 +679,7 @@
         <w:lang w:val="es-ES" w:eastAsia="en-US" w:bidi="ar-SA"/>
       </w:rPr>
     </w:lvl>
-    <w:lvl w:ilvl="6">
-      <w:start w:val="0"/>
+    <w:lvl w:ilvl="6" w:tplc="5E1484CA">
       <w:numFmt w:val="bullet"/>
       <w:lvlText w:val="•"/>
       <w:lvlJc w:val="left"/>
@@ -475,8 +691,7 @@
         <w:lang w:val="es-ES" w:eastAsia="en-US" w:bidi="ar-SA"/>
       </w:rPr>
     </w:lvl>
-    <w:lvl w:ilvl="7">
-      <w:start w:val="0"/>
+    <w:lvl w:ilvl="7" w:tplc="D354FAFC">
       <w:numFmt w:val="bullet"/>
       <w:lvlText w:val="•"/>
       <w:lvlJc w:val="left"/>
@@ -488,8 +703,7 @@
         <w:lang w:val="es-ES" w:eastAsia="en-US" w:bidi="ar-SA"/>
       </w:rPr>
     </w:lvl>
-    <w:lvl w:ilvl="8">
-      <w:start w:val="0"/>
+    <w:lvl w:ilvl="8" w:tplc="1FD812DE">
       <w:numFmt w:val="bullet"/>
       <w:lvlText w:val="•"/>
       <w:lvlJc w:val="left"/>
@@ -502,21 +716,21 @@
       </w:rPr>
     </w:lvl>
   </w:abstractNum>
-  <w:num w:numId="1">
+  <w:num w:numId="1" w16cid:durableId="560555190">
     <w:abstractNumId w:val="0"/>
   </w:num>
 </w:numbering>
 </file>
 
 <file path=word/styles.xml><?xml version="1.0" encoding="utf-8"?>
-<w:styles xmlns:r="http://schemas.openxmlformats.org/officeDocument/2006/relationships" xmlns:w="http://schemas.openxmlformats.org/wordprocessingml/2006/main">
+<w:styles xmlns:mc="http://schemas.openxmlformats.org/markup-compatibility/2006" xmlns:r="http://schemas.openxmlformats.org/officeDocument/2006/relationships" xmlns:w="http://schemas.openxmlformats.org/wordprocessingml/2006/main" xmlns:w14="http://schemas.microsoft.com/office/word/2010/wordml" xmlns:w15="http://schemas.microsoft.com/office/word/2012/wordml" xmlns:w16cex="http://schemas.microsoft.com/office/word/2018/wordml/cex" xmlns:w16cid="http://schemas.microsoft.com/office/word/2016/wordml/cid" xmlns:w16="http://schemas.microsoft.com/office/word/2018/wordml" xmlns:w16du="http://schemas.microsoft.com/office/word/2023/wordml/word16du" xmlns:w16sdtdh="http://schemas.microsoft.com/office/word/2020/wordml/sdtdatahash" xmlns:w16sdtfl="http://schemas.microsoft.com/office/word/2024/wordml/sdtformatlock" xmlns:w16se="http://schemas.microsoft.com/office/word/2015/wordml/symex" mc:Ignorable="w14 w15 w16se w16cid w16 w16cex w16sdtdh w16sdtfl w16du">
   <w:docDefaults>
     <w:rPrDefault>
       <w:rPr>
-        <w:rFonts w:cstheme="minorBidi" w:hAnsiTheme="minorHAnsi" w:eastAsiaTheme="minorHAnsi" w:asciiTheme="minorHAnsi"/>
+        <w:rFonts w:asciiTheme="minorHAnsi" w:eastAsiaTheme="minorHAnsi" w:hAnsiTheme="minorHAnsi" w:cstheme="minorBidi"/>
         <w:sz w:val="22"/>
         <w:szCs w:val="22"/>
-        <w:lang w:val="en-US" w:bidi="ar-SA" w:eastAsia="en-US"/>
+        <w:lang w:val="en-US" w:eastAsia="en-US" w:bidi="ar-SA"/>
       </w:rPr>
     </w:rPrDefault>
     <w:pPrDefault>
@@ -524,19 +738,443 @@
         <w:widowControl w:val="0"/>
         <w:autoSpaceDE w:val="0"/>
         <w:autoSpaceDN w:val="0"/>
-        <w:spacing w:lineRule="auto" w:line="240" w:before="0" w:after="0"/>
-        <w:ind w:left="0" w:right="0"/>
-        <w:jc w:val="left"/>
       </w:pPr>
     </w:pPrDefault>
   </w:docDefaults>
-  <w:style w:styleId="DefaultParagraphFont" w:default="1" w:type="character">
+  <w:latentStyles w:defLockedState="0" w:defUIPriority="99" w:defSemiHidden="0" w:defUnhideWhenUsed="0" w:defQFormat="0" w:count="376">
+    <w:lsdException w:name="Normal" w:uiPriority="0" w:qFormat="1"/>
+    <w:lsdException w:name="heading 1" w:uiPriority="9" w:qFormat="1"/>
+    <w:lsdException w:name="heading 2" w:semiHidden="1" w:uiPriority="9" w:unhideWhenUsed="1" w:qFormat="1"/>
+    <w:lsdException w:name="heading 3" w:semiHidden="1" w:uiPriority="9" w:unhideWhenUsed="1" w:qFormat="1"/>
+    <w:lsdException w:name="heading 4" w:semiHidden="1" w:uiPriority="9" w:unhideWhenUsed="1" w:qFormat="1"/>
+    <w:lsdException w:name="heading 5" w:semiHidden="1" w:uiPriority="9" w:unhideWhenUsed="1" w:qFormat="1"/>
+    <w:lsdException w:name="heading 6" w:semiHidden="1" w:uiPriority="9" w:unhideWhenUsed="1" w:qFormat="1"/>
+    <w:lsdException w:name="heading 7" w:semiHidden="1" w:uiPriority="9" w:unhideWhenUsed="1" w:qFormat="1"/>
+    <w:lsdException w:name="heading 8" w:semiHidden="1" w:uiPriority="9" w:unhideWhenUsed="1" w:qFormat="1"/>
+    <w:lsdException w:name="heading 9" w:semiHidden="1" w:uiPriority="9" w:unhideWhenUsed="1" w:qFormat="1"/>
+    <w:lsdException w:name="index 1" w:semiHidden="1" w:unhideWhenUsed="1"/>
+    <w:lsdException w:name="index 2" w:semiHidden="1" w:unhideWhenUsed="1"/>
+    <w:lsdException w:name="index 3" w:semiHidden="1" w:unhideWhenUsed="1"/>
+    <w:lsdException w:name="index 4" w:semiHidden="1" w:unhideWhenUsed="1"/>
+    <w:lsdException w:name="index 5" w:semiHidden="1" w:unhideWhenUsed="1"/>
+    <w:lsdException w:name="index 6" w:semiHidden="1" w:unhideWhenUsed="1"/>
+    <w:lsdException w:name="index 7" w:semiHidden="1" w:unhideWhenUsed="1"/>
+    <w:lsdException w:name="index 8" w:semiHidden="1" w:unhideWhenUsed="1"/>
+    <w:lsdException w:name="index 9" w:semiHidden="1" w:unhideWhenUsed="1"/>
+    <w:lsdException w:name="toc 1" w:semiHidden="1" w:uiPriority="39" w:unhideWhenUsed="1"/>
+    <w:lsdException w:name="toc 2" w:semiHidden="1" w:uiPriority="39" w:unhideWhenUsed="1"/>
+    <w:lsdException w:name="toc 3" w:semiHidden="1" w:uiPriority="39" w:unhideWhenUsed="1"/>
+    <w:lsdException w:name="toc 4" w:semiHidden="1" w:uiPriority="39" w:unhideWhenUsed="1"/>
+    <w:lsdException w:name="toc 5" w:semiHidden="1" w:uiPriority="39" w:unhideWhenUsed="1"/>
+    <w:lsdException w:name="toc 6" w:semiHidden="1" w:uiPriority="39" w:unhideWhenUsed="1"/>
+    <w:lsdException w:name="toc 7" w:semiHidden="1" w:uiPriority="39" w:unhideWhenUsed="1"/>
+    <w:lsdException w:name="toc 8" w:semiHidden="1" w:uiPriority="39" w:unhideWhenUsed="1"/>
+    <w:lsdException w:name="toc 9" w:semiHidden="1" w:uiPriority="39" w:unhideWhenUsed="1"/>
+    <w:lsdException w:name="Normal Indent" w:semiHidden="1" w:unhideWhenUsed="1"/>
+    <w:lsdException w:name="footnote text" w:semiHidden="1" w:unhideWhenUsed="1"/>
+    <w:lsdException w:name="annotation text" w:semiHidden="1" w:unhideWhenUsed="1"/>
+    <w:lsdException w:name="header" w:semiHidden="1" w:unhideWhenUsed="1"/>
+    <w:lsdException w:name="footer" w:semiHidden="1" w:unhideWhenUsed="1"/>
+    <w:lsdException w:name="index heading" w:semiHidden="1" w:unhideWhenUsed="1"/>
+    <w:lsdException w:name="caption" w:semiHidden="1" w:uiPriority="35" w:unhideWhenUsed="1" w:qFormat="1"/>
+    <w:lsdException w:name="table of figures" w:semiHidden="1" w:unhideWhenUsed="1"/>
+    <w:lsdException w:name="envelope address" w:semiHidden="1" w:unhideWhenUsed="1"/>
+    <w:lsdException w:name="envelope return" w:semiHidden="1" w:unhideWhenUsed="1"/>
+    <w:lsdException w:name="footnote reference" w:semiHidden="1" w:unhideWhenUsed="1"/>
+    <w:lsdException w:name="annotation reference" w:semiHidden="1" w:unhideWhenUsed="1"/>
+    <w:lsdException w:name="line number" w:semiHidden="1" w:unhideWhenUsed="1"/>
+    <w:lsdException w:name="page number" w:semiHidden="1" w:unhideWhenUsed="1"/>
+    <w:lsdException w:name="endnote reference" w:semiHidden="1" w:unhideWhenUsed="1"/>
+    <w:lsdException w:name="endnote text" w:semiHidden="1" w:unhideWhenUsed="1"/>
+    <w:lsdException w:name="table of authorities" w:semiHidden="1" w:unhideWhenUsed="1"/>
+    <w:lsdException w:name="macro" w:semiHidden="1" w:unhideWhenUsed="1"/>
+    <w:lsdException w:name="toa heading" w:semiHidden="1" w:unhideWhenUsed="1"/>
+    <w:lsdException w:name="List" w:semiHidden="1" w:unhideWhenUsed="1"/>
+    <w:lsdException w:name="List Bullet" w:semiHidden="1" w:unhideWhenUsed="1"/>
+    <w:lsdException w:name="List Number" w:semiHidden="1" w:unhideWhenUsed="1"/>
+    <w:lsdException w:name="List 2" w:semiHidden="1" w:unhideWhenUsed="1"/>
+    <w:lsdException w:name="List 3" w:semiHidden="1" w:unhideWhenUsed="1"/>
+    <w:lsdException w:name="List 4" w:semiHidden="1" w:unhideWhenUsed="1"/>
+    <w:lsdException w:name="List 5" w:semiHidden="1" w:unhideWhenUsed="1"/>
+    <w:lsdException w:name="List Bullet 2" w:semiHidden="1" w:unhideWhenUsed="1"/>
+    <w:lsdException w:name="List Bullet 3" w:semiHidden="1" w:unhideWhenUsed="1"/>
+    <w:lsdException w:name="List Bullet 4" w:semiHidden="1" w:unhideWhenUsed="1"/>
+    <w:lsdException w:name="List Bullet 5" w:semiHidden="1" w:unhideWhenUsed="1"/>
+    <w:lsdException w:name="List Number 2" w:semiHidden="1" w:unhideWhenUsed="1"/>
+    <w:lsdException w:name="List Number 3" w:semiHidden="1" w:unhideWhenUsed="1"/>
+    <w:lsdException w:name="List Number 4" w:semiHidden="1" w:unhideWhenUsed="1"/>
+    <w:lsdException w:name="List Number 5" w:semiHidden="1" w:unhideWhenUsed="1"/>
+    <w:lsdException w:name="Title" w:uiPriority="10" w:qFormat="1"/>
+    <w:lsdException w:name="Closing" w:semiHidden="1" w:unhideWhenUsed="1"/>
+    <w:lsdException w:name="Signature" w:semiHidden="1" w:unhideWhenUsed="1"/>
+    <w:lsdException w:name="Default Paragraph Font" w:semiHidden="1" w:uiPriority="1" w:unhideWhenUsed="1"/>
+    <w:lsdException w:name="Body Text" w:semiHidden="1" w:unhideWhenUsed="1"/>
+    <w:lsdException w:name="Body Text Indent" w:semiHidden="1" w:unhideWhenUsed="1"/>
+    <w:lsdException w:name="List Continue" w:semiHidden="1" w:unhideWhenUsed="1"/>
+    <w:lsdException w:name="List Continue 2" w:semiHidden="1" w:unhideWhenUsed="1"/>
+    <w:lsdException w:name="List Continue 3" w:semiHidden="1" w:unhideWhenUsed="1"/>
+    <w:lsdException w:name="List Continue 4" w:semiHidden="1" w:unhideWhenUsed="1"/>
+    <w:lsdException w:name="List Continue 5" w:semiHidden="1" w:unhideWhenUsed="1"/>
+    <w:lsdException w:name="Message Header" w:semiHidden="1" w:unhideWhenUsed="1"/>
+    <w:lsdException w:name="Subtitle" w:uiPriority="11" w:qFormat="1"/>
+    <w:lsdException w:name="Salutation" w:semiHidden="1" w:unhideWhenUsed="1"/>
+    <w:lsdException w:name="Date" w:semiHidden="1" w:unhideWhenUsed="1"/>
+    <w:lsdException w:name="Body Text First Indent" w:semiHidden="1" w:unhideWhenUsed="1"/>
+    <w:lsdException w:name="Body Text First Indent 2" w:semiHidden="1" w:unhideWhenUsed="1"/>
+    <w:lsdException w:name="Note Heading" w:semiHidden="1" w:unhideWhenUsed="1"/>
+    <w:lsdException w:name="Body Text 2" w:semiHidden="1" w:unhideWhenUsed="1"/>
+    <w:lsdException w:name="Body Text 3" w:semiHidden="1" w:unhideWhenUsed="1"/>
+    <w:lsdException w:name="Body Text Indent 2" w:semiHidden="1" w:unhideWhenUsed="1"/>
+    <w:lsdException w:name="Body Text Indent 3" w:semiHidden="1" w:unhideWhenUsed="1"/>
+    <w:lsdException w:name="Block Text" w:semiHidden="1" w:unhideWhenUsed="1"/>
+    <w:lsdException w:name="Hyperlink" w:semiHidden="1" w:unhideWhenUsed="1"/>
+    <w:lsdException w:name="FollowedHyperlink" w:semiHidden="1" w:unhideWhenUsed="1"/>
+    <w:lsdException w:name="Strong" w:uiPriority="22" w:qFormat="1"/>
+    <w:lsdException w:name="Emphasis" w:uiPriority="20" w:qFormat="1"/>
+    <w:lsdException w:name="Document Map" w:semiHidden="1" w:unhideWhenUsed="1"/>
+    <w:lsdException w:name="Plain Text" w:semiHidden="1" w:unhideWhenUsed="1"/>
+    <w:lsdException w:name="E-mail Signature" w:semiHidden="1" w:unhideWhenUsed="1"/>
+    <w:lsdException w:name="HTML Top of Form" w:semiHidden="1" w:unhideWhenUsed="1"/>
+    <w:lsdException w:name="HTML Bottom of Form" w:semiHidden="1" w:unhideWhenUsed="1"/>
+    <w:lsdException w:name="Normal (Web)" w:semiHidden="1" w:unhideWhenUsed="1"/>
+    <w:lsdException w:name="HTML Acronym" w:semiHidden="1" w:unhideWhenUsed="1"/>
+    <w:lsdException w:name="HTML Address" w:semiHidden="1" w:unhideWhenUsed="1"/>
+    <w:lsdException w:name="HTML Cite" w:semiHidden="1" w:unhideWhenUsed="1"/>
+    <w:lsdException w:name="HTML Code" w:semiHidden="1" w:unhideWhenUsed="1"/>
+    <w:lsdException w:name="HTML Definition" w:semiHidden="1" w:unhideWhenUsed="1"/>
+    <w:lsdException w:name="HTML Keyboard" w:semiHidden="1" w:unhideWhenUsed="1"/>
+    <w:lsdException w:name="HTML Preformatted" w:semiHidden="1" w:unhideWhenUsed="1"/>
+    <w:lsdException w:name="HTML Sample" w:semiHidden="1" w:unhideWhenUsed="1"/>
+    <w:lsdException w:name="HTML Typewriter" w:semiHidden="1" w:unhideWhenUsed="1"/>
+    <w:lsdException w:name="HTML Variable" w:semiHidden="1" w:unhideWhenUsed="1"/>
+    <w:lsdException w:name="Normal Table" w:semiHidden="1" w:unhideWhenUsed="1"/>
+    <w:lsdException w:name="annotation subject" w:semiHidden="1" w:unhideWhenUsed="1"/>
+    <w:lsdException w:name="No List" w:semiHidden="1" w:unhideWhenUsed="1"/>
+    <w:lsdException w:name="Outline List 1" w:semiHidden="1" w:unhideWhenUsed="1"/>
+    <w:lsdException w:name="Outline List 2" w:semiHidden="1" w:unhideWhenUsed="1"/>
+    <w:lsdException w:name="Outline List 3" w:semiHidden="1" w:unhideWhenUsed="1"/>
+    <w:lsdException w:name="Table Simple 1" w:semiHidden="1" w:unhideWhenUsed="1"/>
+    <w:lsdException w:name="Table Simple 2" w:semiHidden="1" w:unhideWhenUsed="1"/>
+    <w:lsdException w:name="Table Simple 3" w:semiHidden="1" w:unhideWhenUsed="1"/>
+    <w:lsdException w:name="Table Classic 1" w:semiHidden="1" w:unhideWhenUsed="1"/>
+    <w:lsdException w:name="Table Classic 2" w:semiHidden="1" w:unhideWhenUsed="1"/>
+    <w:lsdException w:name="Table Classic 3" w:semiHidden="1" w:unhideWhenUsed="1"/>
+    <w:lsdException w:name="Table Classic 4" w:semiHidden="1" w:unhideWhenUsed="1"/>
+    <w:lsdException w:name="Table Colorful 1" w:semiHidden="1" w:unhideWhenUsed="1"/>
+    <w:lsdException w:name="Table Colorful 2" w:semiHidden="1" w:unhideWhenUsed="1"/>
+    <w:lsdException w:name="Table Colorful 3" w:semiHidden="1" w:unhideWhenUsed="1"/>
+    <w:lsdException w:name="Table Columns 1" w:semiHidden="1" w:unhideWhenUsed="1"/>
+    <w:lsdException w:name="Table Columns 2" w:semiHidden="1" w:unhideWhenUsed="1"/>
+    <w:lsdException w:name="Table Columns 3" w:semiHidden="1" w:unhideWhenUsed="1"/>
+    <w:lsdException w:name="Table Columns 4" w:semiHidden="1" w:unhideWhenUsed="1"/>
+    <w:lsdException w:name="Table Columns 5" w:semiHidden="1" w:unhideWhenUsed="1"/>
+    <w:lsdException w:name="Table Grid 1" w:semiHidden="1" w:unhideWhenUsed="1"/>
+    <w:lsdException w:name="Table Grid 2" w:semiHidden="1" w:unhideWhenUsed="1"/>
+    <w:lsdException w:name="Table Grid 3" w:semiHidden="1" w:unhideWhenUsed="1"/>
+    <w:lsdException w:name="Table Grid 4" w:semiHidden="1" w:unhideWhenUsed="1"/>
+    <w:lsdException w:name="Table Grid 5" w:semiHidden="1" w:unhideWhenUsed="1"/>
+    <w:lsdException w:name="Table Grid 6" w:semiHidden="1" w:unhideWhenUsed="1"/>
+    <w:lsdException w:name="Table Grid 7" w:semiHidden="1" w:unhideWhenUsed="1"/>
+    <w:lsdException w:name="Table Grid 8" w:semiHidden="1" w:unhideWhenUsed="1"/>
+    <w:lsdException w:name="Table List 1" w:semiHidden="1" w:unhideWhenUsed="1"/>
+    <w:lsdException w:name="Table List 2" w:semiHidden="1" w:unhideWhenUsed="1"/>
+    <w:lsdException w:name="Table List 3" w:semiHidden="1" w:unhideWhenUsed="1"/>
+    <w:lsdException w:name="Table List 4" w:semiHidden="1" w:unhideWhenUsed="1"/>
+    <w:lsdException w:name="Table List 5" w:semiHidden="1" w:unhideWhenUsed="1"/>
+    <w:lsdException w:name="Table List 6" w:semiHidden="1" w:unhideWhenUsed="1"/>
+    <w:lsdException w:name="Table List 7" w:semiHidden="1" w:unhideWhenUsed="1"/>
+    <w:lsdException w:name="Table List 8" w:semiHidden="1" w:unhideWhenUsed="1"/>
+    <w:lsdException w:name="Table 3D effects 1" w:semiHidden="1" w:unhideWhenUsed="1"/>
+    <w:lsdException w:name="Table 3D effects 2" w:semiHidden="1" w:unhideWhenUsed="1"/>
+    <w:lsdException w:name="Table 3D effects 3" w:semiHidden="1" w:unhideWhenUsed="1"/>
+    <w:lsdException w:name="Table Contemporary" w:semiHidden="1" w:unhideWhenUsed="1"/>
+    <w:lsdException w:name="Table Elegant" w:semiHidden="1" w:unhideWhenUsed="1"/>
+    <w:lsdException w:name="Table Professional" w:semiHidden="1" w:unhideWhenUsed="1"/>
+    <w:lsdException w:name="Table Subtle 1" w:semiHidden="1" w:unhideWhenUsed="1"/>
+    <w:lsdException w:name="Table Subtle 2" w:semiHidden="1" w:unhideWhenUsed="1"/>
+    <w:lsdException w:name="Table Web 1" w:semiHidden="1" w:unhideWhenUsed="1"/>
+    <w:lsdException w:name="Table Web 2" w:semiHidden="1" w:unhideWhenUsed="1"/>
+    <w:lsdException w:name="Table Web 3" w:semiHidden="1" w:unhideWhenUsed="1"/>
+    <w:lsdException w:name="Balloon Text" w:semiHidden="1" w:unhideWhenUsed="1"/>
+    <w:lsdException w:name="Table Grid" w:uiPriority="39"/>
+    <w:lsdException w:name="Table Theme" w:semiHidden="1" w:unhideWhenUsed="1"/>
+    <w:lsdException w:name="Placeholder Text" w:semiHidden="1"/>
+    <w:lsdException w:name="No Spacing" w:uiPriority="1" w:qFormat="1"/>
+    <w:lsdException w:name="Light Shading" w:uiPriority="60"/>
+    <w:lsdException w:name="Light List" w:uiPriority="61"/>
+    <w:lsdException w:name="Light Grid" w:uiPriority="62"/>
+    <w:lsdException w:name="Medium Shading 1" w:uiPriority="63"/>
+    <w:lsdException w:name="Medium Shading 2" w:uiPriority="64"/>
+    <w:lsdException w:name="Medium List 1" w:uiPriority="65"/>
+    <w:lsdException w:name="Medium List 2" w:uiPriority="66"/>
+    <w:lsdException w:name="Medium Grid 1" w:uiPriority="67"/>
+    <w:lsdException w:name="Medium Grid 2" w:uiPriority="68"/>
+    <w:lsdException w:name="Medium Grid 3" w:uiPriority="69"/>
+    <w:lsdException w:name="Dark List" w:uiPriority="70"/>
+    <w:lsdException w:name="Colorful Shading" w:uiPriority="71"/>
+    <w:lsdException w:name="Colorful List" w:uiPriority="72"/>
+    <w:lsdException w:name="Colorful Grid" w:uiPriority="73"/>
+    <w:lsdException w:name="Light Shading Accent 1" w:uiPriority="60"/>
+    <w:lsdException w:name="Light List Accent 1" w:uiPriority="61"/>
+    <w:lsdException w:name="Light Grid Accent 1" w:uiPriority="62"/>
+    <w:lsdException w:name="Medium Shading 1 Accent 1" w:uiPriority="63"/>
+    <w:lsdException w:name="Medium Shading 2 Accent 1" w:uiPriority="64"/>
+    <w:lsdException w:name="Medium List 1 Accent 1" w:uiPriority="65"/>
+    <w:lsdException w:name="Revision" w:semiHidden="1"/>
+    <w:lsdException w:name="List Paragraph" w:uiPriority="34" w:qFormat="1"/>
+    <w:lsdException w:name="Quote" w:uiPriority="29" w:qFormat="1"/>
+    <w:lsdException w:name="Intense Quote" w:uiPriority="30" w:qFormat="1"/>
+    <w:lsdException w:name="Medium List 2 Accent 1" w:uiPriority="66"/>
+    <w:lsdException w:name="Medium Grid 1 Accent 1" w:uiPriority="67"/>
+    <w:lsdException w:name="Medium Grid 2 Accent 1" w:uiPriority="68"/>
+    <w:lsdException w:name="Medium Grid 3 Accent 1" w:uiPriority="69"/>
+    <w:lsdException w:name="Dark List Accent 1" w:uiPriority="70"/>
+    <w:lsdException w:name="Colorful Shading Accent 1" w:uiPriority="71"/>
+    <w:lsdException w:name="Colorful List Accent 1" w:uiPriority="72"/>
+    <w:lsdException w:name="Colorful Grid Accent 1" w:uiPriority="73"/>
+    <w:lsdException w:name="Light Shading Accent 2" w:uiPriority="60"/>
+    <w:lsdException w:name="Light List Accent 2" w:uiPriority="61"/>
+    <w:lsdException w:name="Light Grid Accent 2" w:uiPriority="62"/>
+    <w:lsdException w:name="Medium Shading 1 Accent 2" w:uiPriority="63"/>
+    <w:lsdException w:name="Medium Shading 2 Accent 2" w:uiPriority="64"/>
+    <w:lsdException w:name="Medium List 1 Accent 2" w:uiPriority="65"/>
+    <w:lsdException w:name="Medium List 2 Accent 2" w:uiPriority="66"/>
+    <w:lsdException w:name="Medium Grid 1 Accent 2" w:uiPriority="67"/>
+    <w:lsdException w:name="Medium Grid 2 Accent 2" w:uiPriority="68"/>
+    <w:lsdException w:name="Medium Grid 3 Accent 2" w:uiPriority="69"/>
+    <w:lsdException w:name="Dark List Accent 2" w:uiPriority="70"/>
+    <w:lsdException w:name="Colorful Shading Accent 2" w:uiPriority="71"/>
+    <w:lsdException w:name="Colorful List Accent 2" w:uiPriority="72"/>
+    <w:lsdException w:name="Colorful Grid Accent 2" w:uiPriority="73"/>
+    <w:lsdException w:name="Light Shading Accent 3" w:uiPriority="60"/>
+    <w:lsdException w:name="Light List Accent 3" w:uiPriority="61"/>
+    <w:lsdException w:name="Light Grid Accent 3" w:uiPriority="62"/>
+    <w:lsdException w:name="Medium Shading 1 Accent 3" w:uiPriority="63"/>
+    <w:lsdException w:name="Medium Shading 2 Accent 3" w:uiPriority="64"/>
+    <w:lsdException w:name="Medium List 1 Accent 3" w:uiPriority="65"/>
+    <w:lsdException w:name="Medium List 2 Accent 3" w:uiPriority="66"/>
+    <w:lsdException w:name="Medium Grid 1 Accent 3" w:uiPriority="67"/>
+    <w:lsdException w:name="Medium Grid 2 Accent 3" w:uiPriority="68"/>
+    <w:lsdException w:name="Medium Grid 3 Accent 3" w:uiPriority="69"/>
+    <w:lsdException w:name="Dark List Accent 3" w:uiPriority="70"/>
+    <w:lsdException w:name="Colorful Shading Accent 3" w:uiPriority="71"/>
+    <w:lsdException w:name="Colorful List Accent 3" w:uiPriority="72"/>
+    <w:lsdException w:name="Colorful Grid Accent 3" w:uiPriority="73"/>
+    <w:lsdException w:name="Light Shading Accent 4" w:uiPriority="60"/>
+    <w:lsdException w:name="Light List Accent 4" w:uiPriority="61"/>
+    <w:lsdException w:name="Light Grid Accent 4" w:uiPriority="62"/>
+    <w:lsdException w:name="Medium Shading 1 Accent 4" w:uiPriority="63"/>
+    <w:lsdException w:name="Medium Shading 2 Accent 4" w:uiPriority="64"/>
+    <w:lsdException w:name="Medium List 1 Accent 4" w:uiPriority="65"/>
+    <w:lsdException w:name="Medium List 2 Accent 4" w:uiPriority="66"/>
+    <w:lsdException w:name="Medium Grid 1 Accent 4" w:uiPriority="67"/>
+    <w:lsdException w:name="Medium Grid 2 Accent 4" w:uiPriority="68"/>
+    <w:lsdException w:name="Medium Grid 3 Accent 4" w:uiPriority="69"/>
+    <w:lsdException w:name="Dark List Accent 4" w:uiPriority="70"/>
+    <w:lsdException w:name="Colorful Shading Accent 4" w:uiPriority="71"/>
+    <w:lsdException w:name="Colorful List Accent 4" w:uiPriority="72"/>
+    <w:lsdException w:name="Colorful Grid Accent 4" w:uiPriority="73"/>
+    <w:lsdException w:name="Light Shading Accent 5" w:uiPriority="60"/>
+    <w:lsdException w:name="Light List Accent 5" w:uiPriority="61"/>
+    <w:lsdException w:name="Light Grid Accent 5" w:uiPriority="62"/>
+    <w:lsdException w:name="Medium Shading 1 Accent 5" w:uiPriority="63"/>
+    <w:lsdException w:name="Medium Shading 2 Accent 5" w:uiPriority="64"/>
+    <w:lsdException w:name="Medium List 1 Accent 5" w:uiPriority="65"/>
+    <w:lsdException w:name="Medium List 2 Accent 5" w:uiPriority="66"/>
+    <w:lsdException w:name="Medium Grid 1 Accent 5" w:uiPriority="67"/>
+    <w:lsdException w:name="Medium Grid 2 Accent 5" w:uiPriority="68"/>
+    <w:lsdException w:name="Medium Grid 3 Accent 5" w:uiPriority="69"/>
+    <w:lsdException w:name="Dark List Accent 5" w:uiPriority="70"/>
+    <w:lsdException w:name="Colorful Shading Accent 5" w:uiPriority="71"/>
+    <w:lsdException w:name="Colorful List Accent 5" w:uiPriority="72"/>
+    <w:lsdException w:name="Colorful Grid Accent 5" w:uiPriority="73"/>
+    <w:lsdException w:name="Light Shading Accent 6" w:uiPriority="60"/>
+    <w:lsdException w:name="Light List Accent 6" w:uiPriority="61"/>
+    <w:lsdException w:name="Light Grid Accent 6" w:uiPriority="62"/>
+    <w:lsdException w:name="Medium Shading 1 Accent 6" w:uiPriority="63"/>
+    <w:lsdException w:name="Medium Shading 2 Accent 6" w:uiPriority="64"/>
+    <w:lsdException w:name="Medium List 1 Accent 6" w:uiPriority="65"/>
+    <w:lsdException w:name="Medium List 2 Accent 6" w:uiPriority="66"/>
+    <w:lsdException w:name="Medium Grid 1 Accent 6" w:uiPriority="67"/>
+    <w:lsdException w:name="Medium Grid 2 Accent 6" w:uiPriority="68"/>
+    <w:lsdException w:name="Medium Grid 3 Accent 6" w:uiPriority="69"/>
+    <w:lsdException w:name="Dark List Accent 6" w:uiPriority="70"/>
+    <w:lsdException w:name="Colorful Shading Accent 6" w:uiPriority="71"/>
+    <w:lsdException w:name="Colorful List Accent 6" w:uiPriority="72"/>
+    <w:lsdException w:name="Colorful Grid Accent 6" w:uiPriority="73"/>
+    <w:lsdException w:name="Subtle Emphasis" w:uiPriority="19" w:qFormat="1"/>
+    <w:lsdException w:name="Intense Emphasis" w:uiPriority="21" w:qFormat="1"/>
+    <w:lsdException w:name="Subtle Reference" w:uiPriority="31" w:qFormat="1"/>
+    <w:lsdException w:name="Intense Reference" w:uiPriority="32" w:qFormat="1"/>
+    <w:lsdException w:name="Book Title" w:uiPriority="33" w:qFormat="1"/>
+    <w:lsdException w:name="Bibliography" w:semiHidden="1" w:uiPriority="37" w:unhideWhenUsed="1"/>
+    <w:lsdException w:name="TOC Heading" w:semiHidden="1" w:uiPriority="39" w:unhideWhenUsed="1" w:qFormat="1"/>
+    <w:lsdException w:name="Plain Table 1" w:uiPriority="41"/>
+    <w:lsdException w:name="Plain Table 2" w:uiPriority="42"/>
+    <w:lsdException w:name="Plain Table 3" w:uiPriority="43"/>
+    <w:lsdException w:name="Plain Table 4" w:uiPriority="44"/>
+    <w:lsdException w:name="Plain Table 5" w:uiPriority="45"/>
+    <w:lsdException w:name="Grid Table Light" w:uiPriority="40"/>
+    <w:lsdException w:name="Grid Table 1 Light" w:uiPriority="46"/>
+    <w:lsdException w:name="Grid Table 2" w:uiPriority="47"/>
+    <w:lsdException w:name="Grid Table 3" w:uiPriority="48"/>
+    <w:lsdException w:name="Grid Table 4" w:uiPriority="49"/>
+    <w:lsdException w:name="Grid Table 5 Dark" w:uiPriority="50"/>
+    <w:lsdException w:name="Grid Table 6 Colorful" w:uiPriority="51"/>
+    <w:lsdException w:name="Grid Table 7 Colorful" w:uiPriority="52"/>
+    <w:lsdException w:name="Grid Table 1 Light Accent 1" w:uiPriority="46"/>
+    <w:lsdException w:name="Grid Table 2 Accent 1" w:uiPriority="47"/>
+    <w:lsdException w:name="Grid Table 3 Accent 1" w:uiPriority="48"/>
+    <w:lsdException w:name="Grid Table 4 Accent 1" w:uiPriority="49"/>
+    <w:lsdException w:name="Grid Table 5 Dark Accent 1" w:uiPriority="50"/>
+    <w:lsdException w:name="Grid Table 6 Colorful Accent 1" w:uiPriority="51"/>
+    <w:lsdException w:name="Grid Table 7 Colorful Accent 1" w:uiPriority="52"/>
+    <w:lsdException w:name="Grid Table 1 Light Accent 2" w:uiPriority="46"/>
+    <w:lsdException w:name="Grid Table 2 Accent 2" w:uiPriority="47"/>
+    <w:lsdException w:name="Grid Table 3 Accent 2" w:uiPriority="48"/>
+    <w:lsdException w:name="Grid Table 4 Accent 2" w:uiPriority="49"/>
+    <w:lsdException w:name="Grid Table 5 Dark Accent 2" w:uiPriority="50"/>
+    <w:lsdException w:name="Grid Table 6 Colorful Accent 2" w:uiPriority="51"/>
+    <w:lsdException w:name="Grid Table 7 Colorful Accent 2" w:uiPriority="52"/>
+    <w:lsdException w:name="Grid Table 1 Light Accent 3" w:uiPriority="46"/>
+    <w:lsdException w:name="Grid Table 2 Accent 3" w:uiPriority="47"/>
+    <w:lsdException w:name="Grid Table 3 Accent 3" w:uiPriority="48"/>
+    <w:lsdException w:name="Grid Table 4 Accent 3" w:uiPriority="49"/>
+    <w:lsdException w:name="Grid Table 5 Dark Accent 3" w:uiPriority="50"/>
+    <w:lsdException w:name="Grid Table 6 Colorful Accent 3" w:uiPriority="51"/>
+    <w:lsdException w:name="Grid Table 7 Colorful Accent 3" w:uiPriority="52"/>
+    <w:lsdException w:name="Grid Table 1 Light Accent 4" w:uiPriority="46"/>
+    <w:lsdException w:name="Grid Table 2 Accent 4" w:uiPriority="47"/>
+    <w:lsdException w:name="Grid Table 3 Accent 4" w:uiPriority="48"/>
+    <w:lsdException w:name="Grid Table 4 Accent 4" w:uiPriority="49"/>
+    <w:lsdException w:name="Grid Table 5 Dark Accent 4" w:uiPriority="50"/>
+    <w:lsdException w:name="Grid Table 6 Colorful Accent 4" w:uiPriority="51"/>
+    <w:lsdException w:name="Grid Table 7 Colorful Accent 4" w:uiPriority="52"/>
+    <w:lsdException w:name="Grid Table 1 Light Accent 5" w:uiPriority="46"/>
+    <w:lsdException w:name="Grid Table 2 Accent 5" w:uiPriority="47"/>
+    <w:lsdException w:name="Grid Table 3 Accent 5" w:uiPriority="48"/>
+    <w:lsdException w:name="Grid Table 4 Accent 5" w:uiPriority="49"/>
+    <w:lsdException w:name="Grid Table 5 Dark Accent 5" w:uiPriority="50"/>
+    <w:lsdException w:name="Grid Table 6 Colorful Accent 5" w:uiPriority="51"/>
+    <w:lsdException w:name="Grid Table 7 Colorful Accent 5" w:uiPriority="52"/>
+    <w:lsdException w:name="Grid Table 1 Light Accent 6" w:uiPriority="46"/>
+    <w:lsdException w:name="Grid Table 2 Accent 6" w:uiPriority="47"/>
+    <w:lsdException w:name="Grid Table 3 Accent 6" w:uiPriority="48"/>
+    <w:lsdException w:name="Grid Table 4 Accent 6" w:uiPriority="49"/>
+    <w:lsdException w:name="Grid Table 5 Dark Accent 6" w:uiPriority="50"/>
+    <w:lsdException w:name="Grid Table 6 Colorful Accent 6" w:uiPriority="51"/>
+    <w:lsdException w:name="Grid Table 7 Colorful Accent 6" w:uiPriority="52"/>
+    <w:lsdException w:name="List Table 1 Light" w:uiPriority="46"/>
+    <w:lsdException w:name="List Table 2" w:uiPriority="47"/>
+    <w:lsdException w:name="List Table 3" w:uiPriority="48"/>
+    <w:lsdException w:name="List Table 4" w:uiPriority="49"/>
+    <w:lsdException w:name="List Table 5 Dark" w:uiPriority="50"/>
+    <w:lsdException w:name="List Table 6 Colorful" w:uiPriority="51"/>
+    <w:lsdException w:name="List Table 7 Colorful" w:uiPriority="52"/>
+    <w:lsdException w:name="List Table 1 Light Accent 1" w:uiPriority="46"/>
+    <w:lsdException w:name="List Table 2 Accent 1" w:uiPriority="47"/>
+    <w:lsdException w:name="List Table 3 Accent 1" w:uiPriority="48"/>
+    <w:lsdException w:name="List Table 4 Accent 1" w:uiPriority="49"/>
+    <w:lsdException w:name="List Table 5 Dark Accent 1" w:uiPriority="50"/>
+    <w:lsdException w:name="List Table 6 Colorful Accent 1" w:uiPriority="51"/>
+    <w:lsdException w:name="List Table 7 Colorful Accent 1" w:uiPriority="52"/>
+    <w:lsdException w:name="List Table 1 Light Accent 2" w:uiPriority="46"/>
+    <w:lsdException w:name="List Table 2 Accent 2" w:uiPriority="47"/>
+    <w:lsdException w:name="List Table 3 Accent 2" w:uiPriority="48"/>
+    <w:lsdException w:name="List Table 4 Accent 2" w:uiPriority="49"/>
+    <w:lsdException w:name="List Table 5 Dark Accent 2" w:uiPriority="50"/>
+    <w:lsdException w:name="List Table 6 Colorful Accent 2" w:uiPriority="51"/>
+    <w:lsdException w:name="List Table 7 Colorful Accent 2" w:uiPriority="52"/>
+    <w:lsdException w:name="List Table 1 Light Accent 3" w:uiPriority="46"/>
+    <w:lsdException w:name="List Table 2 Accent 3" w:uiPriority="47"/>
+    <w:lsdException w:name="List Table 3 Accent 3" w:uiPriority="48"/>
+    <w:lsdException w:name="List Table 4 Accent 3" w:uiPriority="49"/>
+    <w:lsdException w:name="List Table 5 Dark Accent 3" w:uiPriority="50"/>
+    <w:lsdException w:name="List Table 6 Colorful Accent 3" w:uiPriority="51"/>
+    <w:lsdException w:name="List Table 7 Colorful Accent 3" w:uiPriority="52"/>
+    <w:lsdException w:name="List Table 1 Light Accent 4" w:uiPriority="46"/>
+    <w:lsdException w:name="List Table 2 Accent 4" w:uiPriority="47"/>
+    <w:lsdException w:name="List Table 3 Accent 4" w:uiPriority="48"/>
+    <w:lsdException w:name="List Table 4 Accent 4" w:uiPriority="49"/>
+    <w:lsdException w:name="List Table 5 Dark Accent 4" w:uiPriority="50"/>
+    <w:lsdException w:name="List Table 6 Colorful Accent 4" w:uiPriority="51"/>
+    <w:lsdException w:name="List Table 7 Colorful Accent 4" w:uiPriority="52"/>
+    <w:lsdException w:name="List Table 1 Light Accent 5" w:uiPriority="46"/>
+    <w:lsdException w:name="List Table 2 Accent 5" w:uiPriority="47"/>
+    <w:lsdException w:name="List Table 3 Accent 5" w:uiPriority="48"/>
+    <w:lsdException w:name="List Table 4 Accent 5" w:uiPriority="49"/>
+    <w:lsdException w:name="List Table 5 Dark Accent 5" w:uiPriority="50"/>
+    <w:lsdException w:name="List Table 6 Colorful Accent 5" w:uiPriority="51"/>
+    <w:lsdException w:name="List Table 7 Colorful Accent 5" w:uiPriority="52"/>
+    <w:lsdException w:name="List Table 1 Light Accent 6" w:uiPriority="46"/>
+    <w:lsdException w:name="List Table 2 Accent 6" w:uiPriority="47"/>
+    <w:lsdException w:name="List Table 3 Accent 6" w:uiPriority="48"/>
+    <w:lsdException w:name="List Table 4 Accent 6" w:uiPriority="49"/>
+    <w:lsdException w:name="List Table 5 Dark Accent 6" w:uiPriority="50"/>
+    <w:lsdException w:name="List Table 6 Colorful Accent 6" w:uiPriority="51"/>
+    <w:lsdException w:name="List Table 7 Colorful Accent 6" w:uiPriority="52"/>
+    <w:lsdException w:name="Mention" w:semiHidden="1" w:unhideWhenUsed="1"/>
+    <w:lsdException w:name="Smart Hyperlink" w:semiHidden="1" w:unhideWhenUsed="1"/>
+    <w:lsdException w:name="Hashtag" w:semiHidden="1" w:unhideWhenUsed="1"/>
+    <w:lsdException w:name="Unresolved Mention" w:semiHidden="1" w:unhideWhenUsed="1"/>
+    <w:lsdException w:name="Smart Link" w:semiHidden="1" w:unhideWhenUsed="1"/>
+  </w:latentStyles>
+  <w:style w:type="paragraph" w:default="1" w:styleId="Normal">
+    <w:name w:val="Normal"/>
+    <w:qFormat/>
+    <w:rPr>
+      <w:rFonts w:ascii="Calibri" w:eastAsia="Calibri" w:hAnsi="Calibri" w:cs="Calibri"/>
+      <w:lang w:val="es-ES"/>
+    </w:rPr>
+  </w:style>
+  <w:style w:type="paragraph" w:styleId="Ttulo1">
+    <w:name w:val="heading 1"/>
+    <w:basedOn w:val="Normal"/>
+    <w:uiPriority w:val="9"/>
+    <w:qFormat/>
+    <w:pPr>
+      <w:spacing w:before="47"/>
+      <w:ind w:left="158"/>
+      <w:jc w:val="center"/>
+      <w:outlineLvl w:val="0"/>
+    </w:pPr>
+    <w:rPr>
+      <w:b/>
+      <w:bCs/>
+      <w:i/>
+      <w:iCs/>
+      <w:sz w:val="20"/>
+      <w:szCs w:val="20"/>
+    </w:rPr>
+  </w:style>
+  <w:style w:type="character" w:default="1" w:styleId="Fuentedeprrafopredeter">
     <w:name w:val="Default Paragraph Font"/>
     <w:uiPriority w:val="1"/>
     <w:semiHidden/>
     <w:unhideWhenUsed/>
   </w:style>
-  <w:style w:styleId="TableNormal" w:default="1" w:type="table">
+  <w:style w:type="table" w:default="1" w:styleId="Tablanormal">
+    <w:name w:val="Normal Table"/>
+    <w:uiPriority w:val="99"/>
+    <w:semiHidden/>
+    <w:unhideWhenUsed/>
+    <w:tblPr>
+      <w:tblInd w:w="0" w:type="dxa"/>
+      <w:tblCellMar>
+        <w:top w:w="0" w:type="dxa"/>
+        <w:left w:w="108" w:type="dxa"/>
+        <w:bottom w:w="0" w:type="dxa"/>
+        <w:right w:w="108" w:type="dxa"/>
+      </w:tblCellMar>
+    </w:tblPr>
+  </w:style>
+  <w:style w:type="numbering" w:default="1" w:styleId="Sinlista">
+    <w:name w:val="No List"/>
+    <w:uiPriority w:val="99"/>
+    <w:semiHidden/>
+    <w:unhideWhenUsed/>
+  </w:style>
+  <w:style w:type="table" w:customStyle="1" w:styleId="TableNormal">
     <w:name w:val="Table Normal"/>
     <w:uiPriority w:val="2"/>
     <w:semiHidden/>
@@ -552,58 +1190,17 @@
       </w:tblCellMar>
     </w:tblPr>
   </w:style>
-  <w:style w:styleId="NoList" w:default="1" w:type="numbering">
-    <w:name w:val="No List"/>
-    <w:uiPriority w:val="99"/>
-    <w:semiHidden/>
-    <w:unhideWhenUsed/>
-  </w:style>
-  <w:style w:default="1" w:styleId="Normal" w:type="paragraph">
-    <w:name w:val="Normal"/>
-    <w:uiPriority w:val="1"/>
-    <w:qFormat/>
-    <w:pPr/>
-    <w:rPr>
-      <w:rFonts w:ascii="Calibri" w:hAnsi="Calibri" w:eastAsia="Calibri" w:cs="Calibri"/>
-      <w:lang w:val="es-ES" w:eastAsia="en-US" w:bidi="ar-SA"/>
-    </w:rPr>
-  </w:style>
-  <w:style w:styleId="BodyText" w:type="paragraph">
+  <w:style w:type="paragraph" w:styleId="Textoindependiente">
     <w:name w:val="Body Text"/>
     <w:basedOn w:val="Normal"/>
     <w:uiPriority w:val="1"/>
     <w:qFormat/>
-    <w:pPr/>
     <w:rPr>
-      <w:rFonts w:ascii="Calibri" w:hAnsi="Calibri" w:eastAsia="Calibri" w:cs="Calibri"/>
       <w:sz w:val="20"/>
       <w:szCs w:val="20"/>
-      <w:lang w:val="es-ES" w:eastAsia="en-US" w:bidi="ar-SA"/>
     </w:rPr>
   </w:style>
-  <w:style w:styleId="Heading1" w:type="paragraph">
-    <w:name w:val="Heading 1"/>
-    <w:basedOn w:val="Normal"/>
-    <w:uiPriority w:val="1"/>
-    <w:qFormat/>
-    <w:pPr>
-      <w:spacing w:before="47"/>
-      <w:ind w:left="158"/>
-      <w:jc w:val="center"/>
-      <w:outlineLvl w:val="1"/>
-    </w:pPr>
-    <w:rPr>
-      <w:rFonts w:ascii="Calibri" w:hAnsi="Calibri" w:eastAsia="Calibri" w:cs="Calibri"/>
-      <w:b/>
-      <w:bCs/>
-      <w:i/>
-      <w:iCs/>
-      <w:sz w:val="20"/>
-      <w:szCs w:val="20"/>
-      <w:lang w:val="es-ES" w:eastAsia="en-US" w:bidi="ar-SA"/>
-    </w:rPr>
-  </w:style>
-  <w:style w:styleId="ListParagraph" w:type="paragraph">
+  <w:style w:type="paragraph" w:styleId="Prrafodelista">
     <w:name w:val="List Paragraph"/>
     <w:basedOn w:val="Normal"/>
     <w:uiPriority w:val="1"/>
@@ -612,20 +1209,12 @@
       <w:ind w:left="331" w:right="172"/>
       <w:jc w:val="both"/>
     </w:pPr>
-    <w:rPr>
-      <w:rFonts w:ascii="Calibri" w:hAnsi="Calibri" w:eastAsia="Calibri" w:cs="Calibri"/>
-      <w:lang w:val="es-ES" w:eastAsia="en-US" w:bidi="ar-SA"/>
-    </w:rPr>
   </w:style>
-  <w:style w:styleId="TableParagraph" w:type="paragraph">
+  <w:style w:type="paragraph" w:customStyle="1" w:styleId="TableParagraph">
     <w:name w:val="Table Paragraph"/>
     <w:basedOn w:val="Normal"/>
     <w:uiPriority w:val="1"/>
     <w:qFormat/>
-    <w:pPr/>
-    <w:rPr>
-      <w:lang w:val="es-ES" w:eastAsia="en-US" w:bidi="ar-SA"/>
-    </w:rPr>
   </w:style>
 </w:styles>
 </file>

</xml_diff>

<commit_message>
feat(cartas): personalizar clausula y formato de variables
- Persiste una cláusula editable para describir la duración y transición a los aprendizajes.
- Incorpora variables de tipo de práctica y horas en las plantillas institucionales.
- Renderiza los valores dinámicos como segmentos en negrita dentro del documento DOCX.
- Migra plantillas existentes y cubre el formato final mediante pruebas de generación.
</commit_message>
<xml_diff>
--- a/app/core/assets/presentation_letter_template.docx
+++ b/app/core/assets/presentation_letter_template.docx
@@ -347,15 +347,18 @@
           <w:tab w:val="left" w:pos="489"/>
         </w:tabs>
         <w:spacing w:before="240" w:after="240" w:line="360" w:lineRule="auto"/>
-        <w:ind w:left="489" w:right="174"/>
-        <w:rPr>
-          <w:b/>
-          <w:sz w:val="20"/>
-        </w:rPr>
-      </w:pPr>
-      <w:proofErr w:type="gramStart"/>
-      <w:r>
-        <w:rPr>
+        <w:ind w:left="331" w:right="174"/>
+        <w:rPr>
+          <w:b/>
+          <w:bCs/>
+          <w:sz w:val="20"/>
+        </w:rPr>
+      </w:pPr>
+      <w:proofErr w:type="gramStart"/>
+      <w:r>
+        <w:rPr>
+          <w:b/>
+          <w:bCs/>
           <w:sz w:val="20"/>
         </w:rPr>
         <w:t xml:space="preserve">{{ </w:t>
@@ -363,6 +366,8 @@
       <w:proofErr w:type="spellStart"/>
       <w:r>
         <w:rPr>
+          <w:b/>
+          <w:bCs/>
           <w:sz w:val="20"/>
         </w:rPr>
         <w:t>learning</w:t>
@@ -370,6 +375,8 @@
       <w:proofErr w:type="gramEnd"/>
       <w:r>
         <w:rPr>
+          <w:b/>
+          <w:bCs/>
           <w:sz w:val="20"/>
         </w:rPr>
         <w:t>_outcomes_</w:t>
@@ -377,6 +384,8 @@
       <w:proofErr w:type="gramStart"/>
       <w:r>
         <w:rPr>
+          <w:b/>
+          <w:bCs/>
           <w:sz w:val="20"/>
         </w:rPr>
         <w:t>text</w:t>
@@ -384,6 +393,8 @@
       <w:proofErr w:type="spellEnd"/>
       <w:r>
         <w:rPr>
+          <w:b/>
+          <w:bCs/>
           <w:sz w:val="20"/>
         </w:rPr>
         <w:t xml:space="preserve"> }</w:t>
@@ -391,6 +402,8 @@
       <w:proofErr w:type="gramEnd"/>
       <w:r>
         <w:rPr>
+          <w:b/>
+          <w:bCs/>
           <w:sz w:val="20"/>
         </w:rPr>
         <w:t>}</w:t>

</xml_diff>